<commit_message>
step 83 : editing 1
</commit_message>
<xml_diff>
--- a/video context/video_context_newVersion.docx
+++ b/video context/video_context_newVersion.docx
@@ -13,6 +13,106 @@
         <w:rPr>
           <w:lang w:bidi="fa-IR"/>
         </w:rPr>
+        <w:t>Topics</w:t>
+      </w:r>
+    </w:p>
+    <w:p>
+      <w:pPr>
+        <w:rPr>
+          <w:lang w:bidi="fa-IR"/>
+        </w:rPr>
+      </w:pPr>
+      <w:r>
+        <w:rPr>
+          <w:lang w:bidi="fa-IR"/>
+        </w:rPr>
+        <w:t>Hello and welcome!</w:t>
+      </w:r>
+    </w:p>
+    <w:p>
+      <w:pPr>
+        <w:rPr>
+          <w:lang w:bidi="fa-IR"/>
+        </w:rPr>
+      </w:pPr>
+      <w:r>
+        <w:rPr>
+          <w:lang w:bidi="fa-IR"/>
+        </w:rPr>
+        <w:t>This video marks the beginning of a journey through the foundations of mathematical analysis, with one ultimate destination: understanding the different notions of orthogonality in normed spaces.</w:t>
+      </w:r>
+    </w:p>
+    <w:p>
+      <w:pPr>
+        <w:rPr>
+          <w:lang w:bidi="fa-IR"/>
+        </w:rPr>
+      </w:pPr>
+      <w:r>
+        <w:rPr>
+          <w:lang w:bidi="fa-IR"/>
+        </w:rPr>
+        <w:t>We'll begin with the story of norms—what they are and why they matter. From there, we'll see how metrics arise naturally from norms, explore what it truly means for points to be "close," uncover the idea behind Cauchy sequences, and eventually step into the fascinating world of Banach spaces.</w:t>
+      </w:r>
+    </w:p>
+    <w:p>
+      <w:pPr>
+        <w:rPr>
+          <w:lang w:bidi="fa-IR"/>
+        </w:rPr>
+      </w:pPr>
+      <w:r>
+        <w:rPr>
+          <w:lang w:bidi="fa-IR"/>
+        </w:rPr>
+        <w:t>But our journey doesn't end there.</w:t>
+      </w:r>
+    </w:p>
+    <w:p>
+      <w:pPr>
+        <w:rPr>
+          <w:lang w:bidi="fa-IR"/>
+        </w:rPr>
+      </w:pPr>
+      <w:r>
+        <w:rPr>
+          <w:lang w:bidi="fa-IR"/>
+        </w:rPr>
+        <w:t>Next, we'll introduce inner products, discover how they generate norms, explore the elegant structure of Hilbert spaces, and finally reach our main goal: studying the four most well-known notions of orthogonality in normed spaces.</w:t>
+      </w:r>
+    </w:p>
+    <w:p>
+      <w:pPr>
+        <w:rPr>
+          <w:lang w:bidi="fa-IR"/>
+        </w:rPr>
+      </w:pPr>
+      <w:r>
+        <w:rPr>
+          <w:lang w:bidi="fa-IR"/>
+        </w:rPr>
+        <w:t>So, if you're ready to begin this mathematical adventure, I'll see you in the next video, where we start with the story of norms.</w:t>
+      </w:r>
+    </w:p>
+    <w:p>
+      <w:pPr>
+        <w:rPr>
+          <w:rtl/>
+          <w:lang w:bidi="fa-IR"/>
+        </w:rPr>
+      </w:pPr>
+    </w:p>
+    <w:p>
+      <w:pPr>
+        <w:pStyle w:val="Heading2"/>
+        <w:rPr>
+          <w:lang w:bidi="fa-IR"/>
+        </w:rPr>
+      </w:pPr>
+      <w:r>
+        <w:rPr>
+          <w:lang w:bidi="fa-IR"/>
+        </w:rPr>
         <w:t>The birth of norms</w:t>
       </w:r>
     </w:p>
@@ -139,6 +239,7 @@
         <w:rPr>
           <w:lang w:bidi="fa-IR"/>
         </w:rPr>
+        <w:lastRenderedPageBreak/>
         <w:t>Hilbert spaces</w:t>
       </w:r>
     </w:p>
@@ -182,13 +283,7 @@
         <w:rPr>
           <w:lang w:bidi="fa-IR"/>
         </w:rPr>
-        <w:t>Orthogonality in</w:t>
-      </w:r>
-      <w:r>
-        <w:rPr>
-          <w:lang w:bidi="fa-IR"/>
-        </w:rPr>
-        <w:t xml:space="preserve"> normed spaces</w:t>
+        <w:t>Orthogonality in normed spaces</w:t>
       </w:r>
     </w:p>
     <w:sectPr>
@@ -1192,7 +1287,6 @@
   <w:style w:type="character" w:default="1" w:styleId="DefaultParagraphFont">
     <w:name w:val="Default Paragraph Font"/>
     <w:uiPriority w:val="1"/>
-    <w:semiHidden/>
     <w:unhideWhenUsed/>
   </w:style>
   <w:style w:type="table" w:default="1" w:styleId="TableNormal">

</xml_diff>

<commit_message>
step 84 : add note 1
</commit_message>
<xml_diff>
--- a/video context/video_context_newVersion.docx
+++ b/video context/video_context_newVersion.docx
@@ -26,33 +26,57 @@
         <w:rPr>
           <w:lang w:bidi="fa-IR"/>
         </w:rPr>
-        <w:t>Hello and welcome!</w:t>
-      </w:r>
-    </w:p>
-    <w:p>
-      <w:pPr>
-        <w:rPr>
-          <w:lang w:bidi="fa-IR"/>
-        </w:rPr>
-      </w:pPr>
-      <w:r>
-        <w:rPr>
-          <w:lang w:bidi="fa-IR"/>
-        </w:rPr>
-        <w:t>This video marks the beginning of a journey through the foundations of mathematical analysis, with one ultimate destination: understanding the different notions of orthogonality in normed spaces.</w:t>
-      </w:r>
-    </w:p>
-    <w:p>
-      <w:pPr>
-        <w:rPr>
-          <w:lang w:bidi="fa-IR"/>
-        </w:rPr>
-      </w:pPr>
-      <w:r>
-        <w:rPr>
-          <w:lang w:bidi="fa-IR"/>
-        </w:rPr>
-        <w:t>We'll begin with the story of norms—what they are and why they matter. From there, we'll see how metrics arise naturally from norms, explore what it truly means for points to be "close," uncover the idea behind Cauchy sequences, and eventually step into the fascinating world of Banach spaces.</w:t>
+        <w:t>Hello and welcome to this course!</w:t>
+      </w:r>
+    </w:p>
+    <w:p>
+      <w:pPr>
+        <w:rPr>
+          <w:lang w:bidi="fa-IR"/>
+        </w:rPr>
+      </w:pPr>
+      <w:r>
+        <w:rPr>
+          <w:lang w:bidi="fa-IR"/>
+        </w:rPr>
+        <w:t>This series of videos marks the beginning of a journey through the foundations of mathematical analysis, with one ultimate destination: understanding the different notions of orthogonality in normed spaces.</w:t>
+      </w:r>
+    </w:p>
+    <w:p>
+      <w:pPr>
+        <w:rPr>
+          <w:lang w:bidi="fa-IR"/>
+        </w:rPr>
+      </w:pPr>
+      <w:r>
+        <w:rPr>
+          <w:lang w:bidi="fa-IR"/>
+        </w:rPr>
+        <w:t>We'll begin with the story of the birth of norms—what they are and why they matter. From there, we'll see how norms give rise to metrics</w:t>
+      </w:r>
+      <w:r>
+        <w:rPr>
+          <w:lang w:bidi="fa-IR"/>
+        </w:rPr>
+        <w:t xml:space="preserve">, </w:t>
+      </w:r>
+      <w:r>
+        <w:rPr>
+          <w:lang w:bidi="fa-IR"/>
+        </w:rPr>
+        <w:t>a</w:t>
+      </w:r>
+      <w:r>
+        <w:rPr>
+          <w:lang w:bidi="fa-IR"/>
+        </w:rPr>
+        <w:t>nd understand how distance can be measured</w:t>
+      </w:r>
+      <w:r>
+        <w:rPr>
+          <w:lang w:bidi="fa-IR"/>
+        </w:rPr>
+        <w:t>, explore the mystery of nearness, uncover the idea behind Cauchy sequences, and eventually step into the fascinating world of Banach spaces.</w:t>
       </w:r>
     </w:p>
     <w:p>
@@ -106,6 +130,7 @@
       <w:pPr>
         <w:pStyle w:val="Heading2"/>
         <w:rPr>
+          <w:rtl/>
           <w:lang w:bidi="fa-IR"/>
         </w:rPr>
       </w:pPr>
@@ -122,6 +147,173 @@
           <w:lang w:bidi="fa-IR"/>
         </w:rPr>
       </w:pPr>
+      <w:r>
+        <w:rPr>
+          <w:lang w:bidi="fa-IR"/>
+        </w:rPr>
+        <w:t>1:</w:t>
+      </w:r>
+    </w:p>
+    <w:p>
+      <w:pPr>
+        <w:rPr>
+          <w:lang w:bidi="fa-IR"/>
+        </w:rPr>
+      </w:pPr>
+      <w:r>
+        <w:rPr>
+          <w:lang w:bidi="fa-IR"/>
+        </w:rPr>
+        <w:t>Hello everyone!</w:t>
+      </w:r>
+    </w:p>
+    <w:p>
+      <w:pPr>
+        <w:rPr>
+          <w:lang w:bidi="fa-IR"/>
+        </w:rPr>
+      </w:pPr>
+      <w:r>
+        <w:rPr>
+          <w:lang w:bidi="fa-IR"/>
+        </w:rPr>
+        <w:t>In this video, we're going to explore the story behind the birth of norms.</w:t>
+      </w:r>
+    </w:p>
+    <w:p>
+      <w:pPr>
+        <w:rPr>
+          <w:lang w:bidi="fa-IR"/>
+        </w:rPr>
+      </w:pPr>
+      <w:r>
+        <w:rPr>
+          <w:lang w:bidi="fa-IR"/>
+        </w:rPr>
+        <w:t xml:space="preserve"> We'll discover why mathematicians introduced them, look at several different types of norms, and work through a few examples to build a solid intuition for how they measure the size of vectors.</w:t>
+      </w:r>
+    </w:p>
+    <w:p>
+      <w:pPr>
+        <w:rPr>
+          <w:lang w:bidi="fa-IR"/>
+        </w:rPr>
+      </w:pPr>
+      <w:r>
+        <w:rPr>
+          <w:lang w:bidi="fa-IR"/>
+        </w:rPr>
+        <w:t>But before we begin, let's start with a simple question:</w:t>
+      </w:r>
+    </w:p>
+    <w:p>
+      <w:pPr>
+        <w:rPr>
+          <w:lang w:bidi="fa-IR"/>
+        </w:rPr>
+      </w:pPr>
+      <w:r>
+        <w:rPr>
+          <w:b/>
+          <w:bCs/>
+          <w:lang w:bidi="fa-IR"/>
+        </w:rPr>
+        <w:t>Where did norms come from?</w:t>
+      </w:r>
+    </w:p>
+    <w:p>
+      <w:pPr>
+        <w:rPr>
+          <w:lang w:bidi="fa-IR"/>
+        </w:rPr>
+      </w:pPr>
+      <w:r>
+        <w:rPr>
+          <w:rFonts w:hint="cs"/>
+          <w:rtl/>
+          <w:lang w:bidi="fa-IR"/>
+        </w:rPr>
+        <w:t xml:space="preserve"> </w:t>
+      </w:r>
+      <w:r>
+        <w:rPr>
+          <w:lang w:bidi="fa-IR"/>
+        </w:rPr>
+        <w:t>2:</w:t>
+      </w:r>
+    </w:p>
+    <w:p>
+      <w:pPr>
+        <w:rPr>
+          <w:lang w:bidi="fa-IR"/>
+        </w:rPr>
+      </w:pPr>
+      <w:r>
+        <w:rPr>
+          <w:lang w:bidi="fa-IR"/>
+        </w:rPr>
+        <w:t>To understand the story behind the birth of norms, we first need to travel back in time—about 2,500 years—to Ancient Greece.</w:t>
+      </w:r>
+    </w:p>
+    <w:p>
+      <w:pPr>
+        <w:rPr>
+          <w:lang w:bidi="fa-IR"/>
+        </w:rPr>
+      </w:pPr>
+      <w:r>
+        <w:rPr>
+          <w:lang w:bidi="fa-IR"/>
+        </w:rPr>
+        <w:t>There lived a philosopher and mathematician named Pythagoras.</w:t>
+      </w:r>
+    </w:p>
+    <w:p>
+      <w:pPr>
+        <w:rPr>
+          <w:lang w:bidi="fa-IR"/>
+        </w:rPr>
+      </w:pPr>
+      <w:r>
+        <w:rPr>
+          <w:lang w:bidi="fa-IR"/>
+        </w:rPr>
+        <w:lastRenderedPageBreak/>
+        <w:t>Imagine Pythagoras asking himself a simple question: If I know the lengths of two sides of a right triangle, can I determine the length of the third?</w:t>
+      </w:r>
+    </w:p>
+    <w:p>
+      <w:pPr>
+        <w:rPr>
+          <w:lang w:bidi="fa-IR"/>
+        </w:rPr>
+      </w:pPr>
+      <w:r>
+        <w:rPr>
+          <w:lang w:bidi="fa-IR"/>
+        </w:rPr>
+        <w:t>After a great deal of thought, he discovered a remarkable relationship between the three sides of a right triangle—a result we now know as the Pythagorean theorem.</w:t>
+      </w:r>
+    </w:p>
+    <w:p>
+      <w:pPr>
+        <w:rPr>
+          <w:lang w:bidi="fa-IR"/>
+        </w:rPr>
+      </w:pPr>
+      <w:r>
+        <w:rPr>
+          <w:lang w:bidi="fa-IR"/>
+        </w:rPr>
+        <w:t>3:</w:t>
+      </w:r>
+    </w:p>
+    <w:p>
+      <w:pPr>
+        <w:rPr>
+          <w:lang w:bidi="fa-IR"/>
+        </w:rPr>
+      </w:pPr>
     </w:p>
     <w:p>
       <w:pPr>
@@ -239,7 +431,6 @@
         <w:rPr>
           <w:lang w:bidi="fa-IR"/>
         </w:rPr>
-        <w:lastRenderedPageBreak/>
         <w:t>Hilbert spaces</w:t>
       </w:r>
     </w:p>

</xml_diff>

<commit_message>
step 86 : add note 2
</commit_message>
<xml_diff>
--- a/video context/video_context_newVersion.docx
+++ b/video context/video_context_newVersion.docx
@@ -306,6 +306,317 @@
           <w:lang w:bidi="fa-IR"/>
         </w:rPr>
         <w:t>3:</w:t>
+      </w:r>
+    </w:p>
+    <w:p>
+      <w:pPr>
+        <w:rPr>
+          <w:lang w:bidi="fa-IR"/>
+        </w:rPr>
+      </w:pPr>
+      <w:r>
+        <w:rPr>
+          <w:lang w:bidi="fa-IR"/>
+        </w:rPr>
+        <w:t>Now, let's consider a coordinate system and mark a point ((x, y)) on the plane.</w:t>
+      </w:r>
+    </w:p>
+    <w:p>
+      <w:pPr>
+        <w:rPr>
+          <w:lang w:bidi="fa-IR"/>
+        </w:rPr>
+      </w:pPr>
+      <w:r>
+        <w:rPr>
+          <w:lang w:bidi="fa-IR"/>
+        </w:rPr>
+        <w:t>Our goal is to find the distance from this point to the origin—or equivalently, the length of the corresponding vector.</w:t>
+      </w:r>
+    </w:p>
+    <w:p>
+      <w:pPr>
+        <w:rPr>
+          <w:lang w:bidi="fa-IR"/>
+        </w:rPr>
+      </w:pPr>
+      <w:r>
+        <w:rPr>
+          <w:lang w:bidi="fa-IR"/>
+        </w:rPr>
+        <w:t>To do that, we construct a right triangle, just like the one in the Pythagorean theorem, and apply Pythagoras' formula to compute the length of the vector.</w:t>
+      </w:r>
+    </w:p>
+    <w:p>
+      <w:pPr>
+        <w:rPr>
+          <w:lang w:bidi="fa-IR"/>
+        </w:rPr>
+      </w:pPr>
+      <w:r>
+        <w:rPr>
+          <w:lang w:bidi="fa-IR"/>
+        </w:rPr>
+        <w:t>This notion of length has four important properties.</w:t>
+      </w:r>
+    </w:p>
+    <w:p>
+      <w:pPr>
+        <w:rPr>
+          <w:lang w:bidi="fa-IR"/>
+        </w:rPr>
+      </w:pPr>
+      <w:r>
+        <w:rPr>
+          <w:lang w:bidi="fa-IR"/>
+        </w:rPr>
+        <w:t>First, it is always non-negative.</w:t>
+      </w:r>
+    </w:p>
+    <w:p>
+      <w:pPr>
+        <w:rPr>
+          <w:lang w:bidi="fa-IR"/>
+        </w:rPr>
+      </w:pPr>
+      <w:r>
+        <w:rPr>
+          <w:lang w:bidi="fa-IR"/>
+        </w:rPr>
+        <w:t>Second, the length of a vector is zero if and only if the vector itself is the zero vector.</w:t>
+      </w:r>
+    </w:p>
+    <w:p>
+      <w:pPr>
+        <w:rPr>
+          <w:lang w:bidi="fa-IR"/>
+        </w:rPr>
+      </w:pPr>
+      <w:r>
+        <w:rPr>
+          <w:lang w:bidi="fa-IR"/>
+        </w:rPr>
+        <w:t>Third, suppose we multiply the vector by a real number (t). A simple calculation leads to an interesting result: the length of the new vector becomes (|t|) times the original length.</w:t>
+      </w:r>
+    </w:p>
+    <w:p>
+      <w:pPr>
+        <w:rPr>
+          <w:lang w:bidi="fa-IR"/>
+        </w:rPr>
+      </w:pPr>
+      <w:r>
+        <w:rPr>
+          <w:lang w:bidi="fa-IR"/>
+        </w:rPr>
+        <w:t>If (t) is positive and less than one, the vector shrinks. If (t) is greater than one, the vector stretches. And if (t) is negative, the vector reverses its direction while its length is still scaled by (|t|).</w:t>
+      </w:r>
+    </w:p>
+    <w:p>
+      <w:pPr>
+        <w:rPr>
+          <w:lang w:bidi="fa-IR"/>
+        </w:rPr>
+      </w:pPr>
+      <w:r>
+        <w:rPr>
+          <w:lang w:bidi="fa-IR"/>
+        </w:rPr>
+        <w:t>Finally, this notion of length satisfies the triangle inequality.</w:t>
+      </w:r>
+    </w:p>
+    <w:p>
+      <w:pPr>
+        <w:rPr>
+          <w:lang w:bidi="fa-IR"/>
+        </w:rPr>
+      </w:pPr>
+      <w:r>
+        <w:rPr>
+          <w:lang w:bidi="fa-IR"/>
+        </w:rPr>
+        <w:t>For any two vectors, the sum of their lengths is always greater than or equal to the length of their sum.</w:t>
+      </w:r>
+    </w:p>
+    <w:p>
+      <w:pPr>
+        <w:rPr>
+          <w:lang w:bidi="fa-IR"/>
+        </w:rPr>
+      </w:pPr>
+      <w:r>
+        <w:rPr>
+          <w:lang w:bidi="fa-IR"/>
+        </w:rPr>
+        <w:t>4:</w:t>
+      </w:r>
+    </w:p>
+    <w:p>
+      <w:pPr>
+        <w:rPr>
+          <w:rtl/>
+          <w:lang w:bidi="fa-IR"/>
+        </w:rPr>
+      </w:pPr>
+      <w:r>
+        <w:rPr>
+          <w:lang w:bidi="fa-IR"/>
+        </w:rPr>
+        <w:t>The story didn't end with Pythagoras and his triangles</w:t>
+      </w:r>
+      <w:r>
+        <w:rPr>
+          <w:rFonts w:hint="cs"/>
+          <w:rtl/>
+          <w:lang w:bidi="fa-IR"/>
+        </w:rPr>
+        <w:t>.</w:t>
+      </w:r>
+    </w:p>
+    <w:p>
+      <w:pPr>
+        <w:rPr>
+          <w:lang w:bidi="fa-IR"/>
+        </w:rPr>
+      </w:pPr>
+      <w:r>
+        <w:rPr>
+          <w:lang w:bidi="fa-IR"/>
+        </w:rPr>
+        <w:t>Centuries later, this story continues in the streets of Manhattan.</w:t>
+      </w:r>
+    </w:p>
+    <w:p>
+      <w:pPr>
+        <w:rPr>
+          <w:lang w:bidi="fa-IR"/>
+        </w:rPr>
+      </w:pPr>
+      <w:r>
+        <w:rPr>
+          <w:lang w:bidi="fa-IR"/>
+        </w:rPr>
+        <w:t>Suppose we want to travel from one point to another.</w:t>
+      </w:r>
+    </w:p>
+    <w:p>
+      <w:pPr>
+        <w:rPr>
+          <w:lang w:bidi="fa-IR"/>
+        </w:rPr>
+      </w:pPr>
+      <w:r>
+        <w:rPr>
+          <w:lang w:bidi="fa-IR"/>
+        </w:rPr>
+        <w:t>At first, it might seem natural to follow the straight-line path suggested by the Pythagorean theorem. But in a city like Manhattan, that's simply impossible. We can't drive straight through buildings to reach our destination.</w:t>
+      </w:r>
+    </w:p>
+    <w:p>
+      <w:pPr>
+        <w:rPr>
+          <w:lang w:bidi="fa-IR"/>
+        </w:rPr>
+      </w:pPr>
+      <w:r>
+        <w:rPr>
+          <w:lang w:bidi="fa-IR"/>
+        </w:rPr>
+        <w:t>So we need a different way to measure distance.</w:t>
+      </w:r>
+    </w:p>
+    <w:p>
+      <w:pPr>
+        <w:rPr>
+          <w:lang w:bidi="fa-IR"/>
+        </w:rPr>
+      </w:pPr>
+      <w:r>
+        <w:rPr>
+          <w:lang w:bidi="fa-IR"/>
+        </w:rPr>
+        <w:lastRenderedPageBreak/>
+        <w:t>Instead, we can travel along the streets—perhaps moving upward first, and then turning left until we arrive at the destination.</w:t>
+      </w:r>
+    </w:p>
+    <w:p>
+      <w:pPr>
+        <w:rPr>
+          <w:lang w:bidi="fa-IR"/>
+        </w:rPr>
+      </w:pPr>
+      <w:r>
+        <w:rPr>
+          <w:lang w:bidi="fa-IR"/>
+        </w:rPr>
+        <w:t xml:space="preserve">This idea leads to a completely different notion of distance, one that is known today as the </w:t>
+      </w:r>
+      <w:r>
+        <w:rPr>
+          <w:b/>
+          <w:bCs/>
+          <w:lang w:bidi="fa-IR"/>
+        </w:rPr>
+        <w:t>Manhattan distance</w:t>
+      </w:r>
+      <w:r>
+        <w:rPr>
+          <w:lang w:bidi="fa-IR"/>
+        </w:rPr>
+        <w:t>.</w:t>
+      </w:r>
+    </w:p>
+    <w:p>
+      <w:pPr>
+        <w:rPr>
+          <w:lang w:bidi="fa-IR"/>
+        </w:rPr>
+      </w:pPr>
+      <w:r>
+        <w:rPr>
+          <w:lang w:bidi="fa-IR"/>
+        </w:rPr>
+        <w:t>5:</w:t>
+      </w:r>
+    </w:p>
+    <w:p>
+      <w:pPr>
+        <w:rPr>
+          <w:lang w:bidi="fa-IR"/>
+        </w:rPr>
+      </w:pPr>
+      <w:r>
+        <w:rPr>
+          <w:lang w:bidi="fa-IR"/>
+        </w:rPr>
+        <w:t>Now, let's express this idea mathematically.</w:t>
+      </w:r>
+    </w:p>
+    <w:p>
+      <w:pPr>
+        <w:rPr>
+          <w:lang w:bidi="fa-IR"/>
+        </w:rPr>
+      </w:pPr>
+      <w:r>
+        <w:rPr>
+          <w:lang w:bidi="fa-IR"/>
+        </w:rPr>
+        <w:t xml:space="preserve">The result is the following formula, which is known as the </w:t>
+      </w:r>
+      <w:r>
+        <w:rPr>
+          <w:b/>
+          <w:bCs/>
+          <w:lang w:bidi="fa-IR"/>
+        </w:rPr>
+        <w:t>Manhattan norm</w:t>
+      </w:r>
+      <w:r>
+        <w:rPr>
+          <w:lang w:bidi="fa-IR"/>
+        </w:rPr>
+        <w:t>.</w:t>
       </w:r>
     </w:p>
     <w:p>

</xml_diff>

<commit_message>
step 87 : add note 3
</commit_message>
<xml_diff>
--- a/video context/video_context_newVersion.docx
+++ b/video context/video_context_newVersion.docx
@@ -518,11 +518,19 @@
           <w:lang w:bidi="fa-IR"/>
         </w:rPr>
       </w:pPr>
-      <w:r>
-        <w:rPr>
-          <w:lang w:bidi="fa-IR"/>
-        </w:rPr>
-        <w:t>So we need a different way to measure distance.</w:t>
+      <w:proofErr w:type="gramStart"/>
+      <w:r>
+        <w:rPr>
+          <w:lang w:bidi="fa-IR"/>
+        </w:rPr>
+        <w:t>So</w:t>
+      </w:r>
+      <w:proofErr w:type="gramEnd"/>
+      <w:r>
+        <w:rPr>
+          <w:lang w:bidi="fa-IR"/>
+        </w:rPr>
+        <w:t xml:space="preserve"> we need a different way to measure distance.</w:t>
       </w:r>
     </w:p>
     <w:p>
@@ -617,6 +625,418 @@
           <w:lang w:bidi="fa-IR"/>
         </w:rPr>
         <w:t>.</w:t>
+      </w:r>
+    </w:p>
+    <w:p>
+      <w:pPr>
+        <w:rPr>
+          <w:lang w:bidi="fa-IR"/>
+        </w:rPr>
+      </w:pPr>
+      <w:r>
+        <w:rPr>
+          <w:lang w:bidi="fa-IR"/>
+        </w:rPr>
+        <w:t>6:</w:t>
+      </w:r>
+    </w:p>
+    <w:p>
+      <w:pPr>
+        <w:rPr>
+          <w:lang w:bidi="fa-IR"/>
+        </w:rPr>
+      </w:pPr>
+      <w:r>
+        <w:rPr>
+          <w:lang w:bidi="fa-IR"/>
+        </w:rPr>
+        <w:t>Now, suppose we consider a two-dimensional vector (x).</w:t>
+      </w:r>
+    </w:p>
+    <w:p>
+      <w:pPr>
+        <w:rPr>
+          <w:lang w:bidi="fa-IR"/>
+        </w:rPr>
+      </w:pPr>
+      <w:r>
+        <w:rPr>
+          <w:lang w:bidi="fa-IR"/>
+        </w:rPr>
+        <w:t xml:space="preserve">First, let's measure its length using the Manhattan norm and transform its appearance accordingly. </w:t>
+      </w:r>
+    </w:p>
+    <w:p>
+      <w:pPr>
+        <w:rPr>
+          <w:lang w:bidi="fa-IR"/>
+        </w:rPr>
+      </w:pPr>
+      <w:r>
+        <w:rPr>
+          <w:lang w:bidi="fa-IR"/>
+        </w:rPr>
+        <w:t>Then, let's measure its length using the Pythagorean notion of distance from Euclidean geometry and apply the corresponding transformation as well.</w:t>
+      </w:r>
+    </w:p>
+    <w:p>
+      <w:pPr>
+        <w:rPr>
+          <w:lang w:bidi="fa-IR"/>
+        </w:rPr>
+      </w:pPr>
+      <w:r>
+        <w:rPr>
+          <w:lang w:bidi="fa-IR"/>
+        </w:rPr>
+        <w:t xml:space="preserve">If we look closely at the resulting expressions, we notice that the highlighted green part is identical in both cases. The only thing that changes is the exponent </w:t>
+      </w:r>
+      <w:r>
+        <w:rPr>
+          <w:lang w:bidi="fa-IR"/>
+        </w:rPr>
+        <w:t xml:space="preserve">number </w:t>
+      </w:r>
+      <w:r>
+        <w:rPr>
+          <w:lang w:bidi="fa-IR"/>
+        </w:rPr>
+        <w:t>(p).</w:t>
+      </w:r>
+    </w:p>
+    <w:p>
+      <w:pPr>
+        <w:rPr>
+          <w:lang w:bidi="fa-IR"/>
+        </w:rPr>
+      </w:pPr>
+      <w:r>
+        <w:rPr>
+          <w:lang w:bidi="fa-IR"/>
+        </w:rPr>
+        <w:t xml:space="preserve">Interestingly, it can be shown quite easily that the same four properties of distance that we verified for Euclidean geometry remain valid for every (p </w:t>
+      </w:r>
+      <w:r>
+        <w:rPr>
+          <w:lang w:bidi="fa-IR"/>
+        </w:rPr>
+        <w:t>≥</w:t>
+      </w:r>
+      <w:r>
+        <w:rPr>
+          <w:lang w:bidi="fa-IR"/>
+        </w:rPr>
+        <w:t xml:space="preserve"> 1).</w:t>
+      </w:r>
+    </w:p>
+    <w:p>
+      <w:pPr>
+        <w:rPr>
+          <w:rFonts w:hint="cs"/>
+          <w:rtl/>
+          <w:lang w:bidi="fa-IR"/>
+        </w:rPr>
+      </w:pPr>
+      <w:r>
+        <w:rPr>
+          <w:lang w:bidi="fa-IR"/>
+        </w:rPr>
+        <w:t>7:</w:t>
+      </w:r>
+    </w:p>
+    <w:p>
+      <w:pPr>
+        <w:rPr>
+          <w:lang w:bidi="fa-IR"/>
+        </w:rPr>
+      </w:pPr>
+      <w:r>
+        <w:rPr>
+          <w:lang w:bidi="fa-IR"/>
+        </w:rPr>
+        <w:t>Now, a natural question arises:</w:t>
+      </w:r>
+    </w:p>
+    <w:p>
+      <w:pPr>
+        <w:rPr>
+          <w:lang w:bidi="fa-IR"/>
+        </w:rPr>
+      </w:pPr>
+      <w:r>
+        <w:rPr>
+          <w:b/>
+          <w:bCs/>
+          <w:lang w:bidi="fa-IR"/>
+        </w:rPr>
+        <w:t>What happens if we try to generalize this idea?</w:t>
+      </w:r>
+    </w:p>
+    <w:p>
+      <w:pPr>
+        <w:rPr>
+          <w:lang w:bidi="fa-IR"/>
+        </w:rPr>
+      </w:pPr>
+      <w:r>
+        <w:rPr>
+          <w:lang w:bidi="fa-IR"/>
+        </w:rPr>
+        <w:t xml:space="preserve">This is exactly where </w:t>
+      </w:r>
+      <w:r>
+        <w:rPr>
+          <w:b/>
+          <w:bCs/>
+          <w:lang w:bidi="fa-IR"/>
+        </w:rPr>
+        <w:t>norms</w:t>
+      </w:r>
+      <w:r>
+        <w:rPr>
+          <w:lang w:bidi="fa-IR"/>
+        </w:rPr>
+        <w:t xml:space="preserve"> come into the picture.</w:t>
+      </w:r>
+    </w:p>
+    <w:p>
+      <w:pPr>
+        <w:rPr>
+          <w:lang w:bidi="fa-IR"/>
+        </w:rPr>
+      </w:pPr>
+      <w:r>
+        <w:rPr>
+          <w:lang w:bidi="fa-IR"/>
+        </w:rPr>
+        <w:t xml:space="preserve">A </w:t>
+      </w:r>
+      <w:r>
+        <w:rPr>
+          <w:b/>
+          <w:bCs/>
+          <w:lang w:bidi="fa-IR"/>
+        </w:rPr>
+        <w:t>norm</w:t>
+      </w:r>
+      <w:r>
+        <w:rPr>
+          <w:lang w:bidi="fa-IR"/>
+        </w:rPr>
+        <w:t xml:space="preserve"> is a function that maps a vector space (X) to the real numbers, and it satisfies three fundamental properties:</w:t>
+      </w:r>
+    </w:p>
+    <w:p>
+      <w:pPr>
+        <w:numPr>
+          <w:ilvl w:val="0"/>
+          <w:numId w:val="4"/>
+        </w:numPr>
+        <w:rPr>
+          <w:lang w:bidi="fa-IR"/>
+        </w:rPr>
+      </w:pPr>
+      <w:r>
+        <w:rPr>
+          <w:b/>
+          <w:bCs/>
+          <w:lang w:bidi="fa-IR"/>
+        </w:rPr>
+        <w:t>Positive Definiteness</w:t>
+      </w:r>
+    </w:p>
+    <w:p>
+      <w:pPr>
+        <w:numPr>
+          <w:ilvl w:val="0"/>
+          <w:numId w:val="4"/>
+        </w:numPr>
+        <w:rPr>
+          <w:lang w:bidi="fa-IR"/>
+        </w:rPr>
+      </w:pPr>
+      <w:r>
+        <w:rPr>
+          <w:b/>
+          <w:bCs/>
+          <w:lang w:bidi="fa-IR"/>
+        </w:rPr>
+        <w:t>Absolute Homogeneity</w:t>
+      </w:r>
+    </w:p>
+    <w:p>
+      <w:pPr>
+        <w:numPr>
+          <w:ilvl w:val="0"/>
+          <w:numId w:val="4"/>
+        </w:numPr>
+        <w:rPr>
+          <w:lang w:bidi="fa-IR"/>
+        </w:rPr>
+      </w:pPr>
+      <w:r>
+        <w:rPr>
+          <w:b/>
+          <w:bCs/>
+          <w:lang w:bidi="fa-IR"/>
+        </w:rPr>
+        <w:t>The Triangle Inequality</w:t>
+      </w:r>
+    </w:p>
+    <w:p>
+      <w:pPr>
+        <w:rPr>
+          <w:rtl/>
+          <w:lang w:bidi="fa-IR"/>
+        </w:rPr>
+      </w:pPr>
+      <w:r>
+        <w:rPr>
+          <w:lang w:bidi="fa-IR"/>
+        </w:rPr>
+        <w:t>Intuitively, in two dimensions, a norm simply measures the distance from the origin to a point—or, equivalently, the length of the corresponding vector.</w:t>
+      </w:r>
+    </w:p>
+    <w:p>
+      <w:pPr>
+        <w:rPr>
+          <w:lang w:bidi="fa-IR"/>
+        </w:rPr>
+      </w:pPr>
+      <w:proofErr w:type="gramStart"/>
+      <w:r>
+        <w:rPr>
+          <w:lang w:bidi="fa-IR"/>
+        </w:rPr>
+        <w:lastRenderedPageBreak/>
+        <w:t>8 :</w:t>
+      </w:r>
+      <w:proofErr w:type="gramEnd"/>
+      <w:r>
+        <w:rPr>
+          <w:lang w:bidi="fa-IR"/>
+        </w:rPr>
+        <w:t xml:space="preserve"> </w:t>
+      </w:r>
+    </w:p>
+    <w:p>
+      <w:pPr>
+        <w:rPr>
+          <w:lang w:bidi="fa-IR"/>
+        </w:rPr>
+      </w:pPr>
+      <w:r>
+        <w:rPr>
+          <w:lang w:bidi="fa-IR"/>
+        </w:rPr>
+        <w:t>From the three axioms of a norm, we can immediately derive an important consequence:</w:t>
+      </w:r>
+    </w:p>
+    <w:p>
+      <w:pPr>
+        <w:rPr>
+          <w:rFonts w:hint="cs"/>
+          <w:rtl/>
+          <w:lang w:bidi="fa-IR"/>
+        </w:rPr>
+      </w:pPr>
+      <w:r>
+        <w:rPr>
+          <w:lang w:bidi="fa-IR"/>
+        </w:rPr>
+        <w:t>Norm of x is always non-negative</w:t>
+      </w:r>
+    </w:p>
+    <w:p>
+      <w:pPr>
+        <w:rPr>
+          <w:lang w:bidi="fa-IR"/>
+        </w:rPr>
+      </w:pPr>
+      <w:r>
+        <w:rPr>
+          <w:lang w:bidi="fa-IR"/>
+        </w:rPr>
+        <w:t>Let's go through the proof together.</w:t>
+      </w:r>
+    </w:p>
+    <w:p>
+      <w:pPr>
+        <w:rPr>
+          <w:lang w:bidi="fa-IR"/>
+        </w:rPr>
+      </w:pPr>
+      <w:r>
+        <w:rPr>
+          <w:lang w:bidi="fa-IR"/>
+        </w:rPr>
+        <w:t xml:space="preserve">We begin with the </w:t>
+      </w:r>
+      <w:r>
+        <w:rPr>
+          <w:b/>
+          <w:bCs/>
+          <w:lang w:bidi="fa-IR"/>
+        </w:rPr>
+        <w:t>triangle inequality</w:t>
+      </w:r>
+      <w:r>
+        <w:rPr>
+          <w:lang w:bidi="fa-IR"/>
+        </w:rPr>
+        <w:t>.</w:t>
+      </w:r>
+    </w:p>
+    <w:p>
+      <w:pPr>
+        <w:rPr>
+          <w:lang w:bidi="fa-IR"/>
+        </w:rPr>
+      </w:pPr>
+      <w:r>
+        <w:rPr>
+          <w:lang w:bidi="fa-IR"/>
+        </w:rPr>
+        <w:t>Next, we substitute the appropriate vector and simplify the resulting expression.</w:t>
+      </w:r>
+    </w:p>
+    <w:p>
+      <w:pPr>
+        <w:rPr>
+          <w:lang w:bidi="fa-IR"/>
+        </w:rPr>
+      </w:pPr>
+      <w:r>
+        <w:rPr>
+          <w:lang w:bidi="fa-IR"/>
+        </w:rPr>
+        <w:t>Finally, after a little rearrangement, we obtain exactly what we wanted to prove:</w:t>
+      </w:r>
+    </w:p>
+    <w:p>
+      <w:pPr>
+        <w:rPr>
+          <w:lang w:bidi="fa-IR"/>
+        </w:rPr>
+      </w:pPr>
+      <w:r>
+        <w:rPr>
+          <w:lang w:bidi="fa-IR"/>
+        </w:rPr>
+        <w:t>Intuitively, this result is exactly what we would expect.</w:t>
+      </w:r>
+    </w:p>
+    <w:p>
+      <w:pPr>
+        <w:rPr>
+          <w:lang w:bidi="fa-IR"/>
+        </w:rPr>
+      </w:pPr>
+      <w:r>
+        <w:rPr>
+          <w:lang w:bidi="fa-IR"/>
+        </w:rPr>
+        <w:t>Since a norm represents the length of a vector, and a length can never be negative, So the result agrees perfectly with our geometric intuition.</w:t>
       </w:r>
     </w:p>
     <w:p>
@@ -914,6 +1334,155 @@
     </w:lvl>
   </w:abstractNum>
   <w:abstractNum w:abstractNumId="1" w15:restartNumberingAfterBreak="0">
+    <w:nsid w:val="35D57A28"/>
+    <w:multiLevelType w:val="multilevel"/>
+    <w:tmpl w:val="258CCE06"/>
+    <w:lvl w:ilvl="0">
+      <w:start w:val="1"/>
+      <w:numFmt w:val="bullet"/>
+      <w:lvlText w:val=""/>
+      <w:lvlJc w:val="left"/>
+      <w:pPr>
+        <w:tabs>
+          <w:tab w:val="num" w:pos="720"/>
+        </w:tabs>
+        <w:ind w:left="720" w:hanging="360"/>
+      </w:pPr>
+      <w:rPr>
+        <w:rFonts w:ascii="Symbol" w:hAnsi="Symbol" w:hint="default"/>
+        <w:sz w:val="20"/>
+      </w:rPr>
+    </w:lvl>
+    <w:lvl w:ilvl="1" w:tentative="1">
+      <w:start w:val="1"/>
+      <w:numFmt w:val="bullet"/>
+      <w:lvlText w:val="o"/>
+      <w:lvlJc w:val="left"/>
+      <w:pPr>
+        <w:tabs>
+          <w:tab w:val="num" w:pos="1440"/>
+        </w:tabs>
+        <w:ind w:left="1440" w:hanging="360"/>
+      </w:pPr>
+      <w:rPr>
+        <w:rFonts w:ascii="Courier New" w:hAnsi="Courier New" w:hint="default"/>
+        <w:sz w:val="20"/>
+      </w:rPr>
+    </w:lvl>
+    <w:lvl w:ilvl="2" w:tentative="1">
+      <w:start w:val="1"/>
+      <w:numFmt w:val="bullet"/>
+      <w:lvlText w:val=""/>
+      <w:lvlJc w:val="left"/>
+      <w:pPr>
+        <w:tabs>
+          <w:tab w:val="num" w:pos="2160"/>
+        </w:tabs>
+        <w:ind w:left="2160" w:hanging="360"/>
+      </w:pPr>
+      <w:rPr>
+        <w:rFonts w:ascii="Wingdings" w:hAnsi="Wingdings" w:hint="default"/>
+        <w:sz w:val="20"/>
+      </w:rPr>
+    </w:lvl>
+    <w:lvl w:ilvl="3" w:tentative="1">
+      <w:start w:val="1"/>
+      <w:numFmt w:val="bullet"/>
+      <w:lvlText w:val=""/>
+      <w:lvlJc w:val="left"/>
+      <w:pPr>
+        <w:tabs>
+          <w:tab w:val="num" w:pos="2880"/>
+        </w:tabs>
+        <w:ind w:left="2880" w:hanging="360"/>
+      </w:pPr>
+      <w:rPr>
+        <w:rFonts w:ascii="Wingdings" w:hAnsi="Wingdings" w:hint="default"/>
+        <w:sz w:val="20"/>
+      </w:rPr>
+    </w:lvl>
+    <w:lvl w:ilvl="4" w:tentative="1">
+      <w:start w:val="1"/>
+      <w:numFmt w:val="bullet"/>
+      <w:lvlText w:val=""/>
+      <w:lvlJc w:val="left"/>
+      <w:pPr>
+        <w:tabs>
+          <w:tab w:val="num" w:pos="3600"/>
+        </w:tabs>
+        <w:ind w:left="3600" w:hanging="360"/>
+      </w:pPr>
+      <w:rPr>
+        <w:rFonts w:ascii="Wingdings" w:hAnsi="Wingdings" w:hint="default"/>
+        <w:sz w:val="20"/>
+      </w:rPr>
+    </w:lvl>
+    <w:lvl w:ilvl="5" w:tentative="1">
+      <w:start w:val="1"/>
+      <w:numFmt w:val="bullet"/>
+      <w:lvlText w:val=""/>
+      <w:lvlJc w:val="left"/>
+      <w:pPr>
+        <w:tabs>
+          <w:tab w:val="num" w:pos="4320"/>
+        </w:tabs>
+        <w:ind w:left="4320" w:hanging="360"/>
+      </w:pPr>
+      <w:rPr>
+        <w:rFonts w:ascii="Wingdings" w:hAnsi="Wingdings" w:hint="default"/>
+        <w:sz w:val="20"/>
+      </w:rPr>
+    </w:lvl>
+    <w:lvl w:ilvl="6" w:tentative="1">
+      <w:start w:val="1"/>
+      <w:numFmt w:val="bullet"/>
+      <w:lvlText w:val=""/>
+      <w:lvlJc w:val="left"/>
+      <w:pPr>
+        <w:tabs>
+          <w:tab w:val="num" w:pos="5040"/>
+        </w:tabs>
+        <w:ind w:left="5040" w:hanging="360"/>
+      </w:pPr>
+      <w:rPr>
+        <w:rFonts w:ascii="Wingdings" w:hAnsi="Wingdings" w:hint="default"/>
+        <w:sz w:val="20"/>
+      </w:rPr>
+    </w:lvl>
+    <w:lvl w:ilvl="7" w:tentative="1">
+      <w:start w:val="1"/>
+      <w:numFmt w:val="bullet"/>
+      <w:lvlText w:val=""/>
+      <w:lvlJc w:val="left"/>
+      <w:pPr>
+        <w:tabs>
+          <w:tab w:val="num" w:pos="5760"/>
+        </w:tabs>
+        <w:ind w:left="5760" w:hanging="360"/>
+      </w:pPr>
+      <w:rPr>
+        <w:rFonts w:ascii="Wingdings" w:hAnsi="Wingdings" w:hint="default"/>
+        <w:sz w:val="20"/>
+      </w:rPr>
+    </w:lvl>
+    <w:lvl w:ilvl="8" w:tentative="1">
+      <w:start w:val="1"/>
+      <w:numFmt w:val="bullet"/>
+      <w:lvlText w:val=""/>
+      <w:lvlJc w:val="left"/>
+      <w:pPr>
+        <w:tabs>
+          <w:tab w:val="num" w:pos="6480"/>
+        </w:tabs>
+        <w:ind w:left="6480" w:hanging="360"/>
+      </w:pPr>
+      <w:rPr>
+        <w:rFonts w:ascii="Wingdings" w:hAnsi="Wingdings" w:hint="default"/>
+        <w:sz w:val="20"/>
+      </w:rPr>
+    </w:lvl>
+  </w:abstractNum>
+  <w:abstractNum w:abstractNumId="2" w15:restartNumberingAfterBreak="0">
     <w:nsid w:val="39192607"/>
     <w:multiLevelType w:val="multilevel"/>
     <w:tmpl w:val="28B28172"/>
@@ -1062,7 +1631,7 @@
       </w:rPr>
     </w:lvl>
   </w:abstractNum>
-  <w:abstractNum w:abstractNumId="2" w15:restartNumberingAfterBreak="0">
+  <w:abstractNum w:abstractNumId="3" w15:restartNumberingAfterBreak="0">
     <w:nsid w:val="44D13775"/>
     <w:multiLevelType w:val="hybridMultilevel"/>
     <w:tmpl w:val="A27053F0"/>
@@ -1179,10 +1748,13 @@
     <w:abstractNumId w:val="0"/>
   </w:num>
   <w:num w:numId="2" w16cid:durableId="720520086">
-    <w:abstractNumId w:val="1"/>
+    <w:abstractNumId w:val="2"/>
   </w:num>
   <w:num w:numId="3" w16cid:durableId="120460704">
-    <w:abstractNumId w:val="2"/>
+    <w:abstractNumId w:val="3"/>
+  </w:num>
+  <w:num w:numId="4" w16cid:durableId="423035742">
+    <w:abstractNumId w:val="1"/>
   </w:num>
 </w:numbering>
 </file>

</xml_diff>

<commit_message>
step 88 : add note fimish part1 start part2
</commit_message>
<xml_diff>
--- a/video context/video_context_newVersion.docx
+++ b/video context/video_context_newVersion.docx
@@ -518,19 +518,11 @@
           <w:lang w:bidi="fa-IR"/>
         </w:rPr>
       </w:pPr>
-      <w:proofErr w:type="gramStart"/>
-      <w:r>
-        <w:rPr>
-          <w:lang w:bidi="fa-IR"/>
-        </w:rPr>
-        <w:t>So</w:t>
-      </w:r>
-      <w:proofErr w:type="gramEnd"/>
-      <w:r>
-        <w:rPr>
-          <w:lang w:bidi="fa-IR"/>
-        </w:rPr>
-        <w:t xml:space="preserve"> we need a different way to measure distance.</w:t>
+      <w:r>
+        <w:rPr>
+          <w:lang w:bidi="fa-IR"/>
+        </w:rPr>
+        <w:t>So we need a different way to measure distance.</w:t>
       </w:r>
     </w:p>
     <w:p>
@@ -732,7 +724,6 @@
     <w:p>
       <w:pPr>
         <w:rPr>
-          <w:rFonts w:hint="cs"/>
           <w:rtl/>
           <w:lang w:bidi="fa-IR"/>
         </w:rPr>
@@ -903,148 +894,853 @@
           <w:lang w:bidi="fa-IR"/>
         </w:rPr>
       </w:pPr>
-      <w:proofErr w:type="gramStart"/>
       <w:r>
         <w:rPr>
           <w:lang w:bidi="fa-IR"/>
         </w:rPr>
         <w:lastRenderedPageBreak/>
-        <w:t>8 :</w:t>
-      </w:r>
-      <w:proofErr w:type="gramEnd"/>
-      <w:r>
-        <w:rPr>
+        <w:t xml:space="preserve">8 : </w:t>
+      </w:r>
+    </w:p>
+    <w:p>
+      <w:pPr>
+        <w:rPr>
+          <w:lang w:bidi="fa-IR"/>
+        </w:rPr>
+      </w:pPr>
+      <w:r>
+        <w:rPr>
+          <w:lang w:bidi="fa-IR"/>
+        </w:rPr>
+        <w:t>From the three axioms of a norm, we can immediately derive an important consequence:</w:t>
+      </w:r>
+    </w:p>
+    <w:p>
+      <w:pPr>
+        <w:rPr>
+          <w:rtl/>
+          <w:lang w:bidi="fa-IR"/>
+        </w:rPr>
+      </w:pPr>
+      <w:r>
+        <w:rPr>
+          <w:lang w:bidi="fa-IR"/>
+        </w:rPr>
+        <w:t>Norm of x is always non-negative</w:t>
+      </w:r>
+    </w:p>
+    <w:p>
+      <w:pPr>
+        <w:rPr>
+          <w:lang w:bidi="fa-IR"/>
+        </w:rPr>
+      </w:pPr>
+      <w:r>
+        <w:rPr>
+          <w:lang w:bidi="fa-IR"/>
+        </w:rPr>
+        <w:t>Let's go through the proof together.</w:t>
+      </w:r>
+    </w:p>
+    <w:p>
+      <w:pPr>
+        <w:rPr>
+          <w:lang w:bidi="fa-IR"/>
+        </w:rPr>
+      </w:pPr>
+      <w:r>
+        <w:rPr>
+          <w:lang w:bidi="fa-IR"/>
+        </w:rPr>
+        <w:t xml:space="preserve">We begin with the </w:t>
+      </w:r>
+      <w:r>
+        <w:rPr>
+          <w:b/>
+          <w:bCs/>
+          <w:lang w:bidi="fa-IR"/>
+        </w:rPr>
+        <w:t>triangle inequality</w:t>
+      </w:r>
+      <w:r>
+        <w:rPr>
+          <w:lang w:bidi="fa-IR"/>
+        </w:rPr>
+        <w:t>.</w:t>
+      </w:r>
+    </w:p>
+    <w:p>
+      <w:pPr>
+        <w:rPr>
+          <w:lang w:bidi="fa-IR"/>
+        </w:rPr>
+      </w:pPr>
+      <w:r>
+        <w:rPr>
+          <w:lang w:bidi="fa-IR"/>
+        </w:rPr>
+        <w:t>Next, we substitute the appropriate vector and simplify the resulting expression.</w:t>
+      </w:r>
+    </w:p>
+    <w:p>
+      <w:pPr>
+        <w:rPr>
+          <w:lang w:bidi="fa-IR"/>
+        </w:rPr>
+      </w:pPr>
+      <w:r>
+        <w:rPr>
+          <w:lang w:bidi="fa-IR"/>
+        </w:rPr>
+        <w:t>Finally, after a little rearrangement, we obtain exactly what we wanted to prove:</w:t>
+      </w:r>
+    </w:p>
+    <w:p>
+      <w:pPr>
+        <w:rPr>
+          <w:lang w:bidi="fa-IR"/>
+        </w:rPr>
+      </w:pPr>
+      <w:r>
+        <w:rPr>
+          <w:lang w:bidi="fa-IR"/>
+        </w:rPr>
+        <w:t>Intuitively, this result is exactly what we would expect.</w:t>
+      </w:r>
+    </w:p>
+    <w:p>
+      <w:pPr>
+        <w:rPr>
+          <w:lang w:bidi="fa-IR"/>
+        </w:rPr>
+      </w:pPr>
+      <w:r>
+        <w:rPr>
+          <w:lang w:bidi="fa-IR"/>
+        </w:rPr>
+        <w:t>Since a norm represents the length of a vector, and a length can never be negative, So the result agrees perfectly with our geometric intuition.</w:t>
+      </w:r>
+    </w:p>
+    <w:p>
+      <w:pPr>
+        <w:rPr>
+          <w:lang w:bidi="fa-IR"/>
+        </w:rPr>
+      </w:pPr>
+      <w:r>
+        <w:rPr>
+          <w:lang w:bidi="fa-IR"/>
+        </w:rPr>
+        <w:t>9 :</w:t>
+      </w:r>
+    </w:p>
+    <w:p>
+      <w:pPr>
+        <w:rPr>
+          <w:lang w:bidi="fa-IR"/>
+        </w:rPr>
+      </w:pPr>
+      <w:r>
+        <w:rPr>
+          <w:lang w:bidi="fa-IR"/>
+        </w:rPr>
+        <w:t xml:space="preserve">Let's now visualize the </w:t>
+      </w:r>
+      <w:r>
+        <w:rPr>
+          <w:b/>
+          <w:bCs/>
+          <w:lang w:bidi="fa-IR"/>
+        </w:rPr>
+        <w:t>ball of radius 3</w:t>
+      </w:r>
+      <w:r>
+        <w:rPr>
+          <w:rFonts w:hint="cs"/>
+          <w:b/>
+          <w:bCs/>
+          <w:rtl/>
           <w:lang w:bidi="fa-IR"/>
         </w:rPr>
         <w:t xml:space="preserve"> </w:t>
       </w:r>
-    </w:p>
-    <w:p>
-      <w:pPr>
-        <w:rPr>
-          <w:lang w:bidi="fa-IR"/>
-        </w:rPr>
-      </w:pPr>
-      <w:r>
-        <w:rPr>
-          <w:lang w:bidi="fa-IR"/>
-        </w:rPr>
-        <w:t>From the three axioms of a norm, we can immediately derive an important consequence:</w:t>
-      </w:r>
-    </w:p>
-    <w:p>
-      <w:pPr>
+      <w:r>
+        <w:rPr>
+          <w:lang w:bidi="fa-IR"/>
+        </w:rPr>
+        <w:t>under different norms.</w:t>
+      </w:r>
+    </w:p>
+    <w:p>
+      <w:pPr>
+        <w:rPr>
+          <w:lang w:bidi="fa-IR"/>
+        </w:rPr>
+      </w:pPr>
+      <w:r>
+        <w:rPr>
+          <w:lang w:bidi="fa-IR"/>
+        </w:rPr>
+        <w:t xml:space="preserve">Suppose that </w:t>
+      </w:r>
+      <w:r>
+        <w:rPr>
+          <w:b/>
+          <w:bCs/>
+          <w:lang w:bidi="fa-IR"/>
+        </w:rPr>
+        <w:t>x</w:t>
+      </w:r>
+      <w:r>
+        <w:rPr>
+          <w:lang w:bidi="fa-IR"/>
+        </w:rPr>
+        <w:t xml:space="preserve"> is an </w:t>
+      </w:r>
+      <w:r>
+        <w:rPr>
+          <w:b/>
+          <w:bCs/>
+          <w:lang w:bidi="fa-IR"/>
+        </w:rPr>
+        <w:t>n-dimensional real vector</w:t>
+      </w:r>
+      <w:r>
+        <w:rPr>
+          <w:lang w:bidi="fa-IR"/>
+        </w:rPr>
+        <w:t>.</w:t>
+      </w:r>
+    </w:p>
+    <w:p>
+      <w:pPr>
+        <w:rPr>
+          <w:lang w:bidi="fa-IR"/>
+        </w:rPr>
+      </w:pPr>
+      <w:r>
+        <w:rPr>
+          <w:lang w:bidi="fa-IR"/>
+        </w:rPr>
+        <w:t xml:space="preserve">Now consider the </w:t>
+      </w:r>
+      <w:r>
+        <w:rPr>
+          <w:b/>
+          <w:bCs/>
+          <w:lang w:bidi="fa-IR"/>
+        </w:rPr>
+        <w:t>p-norm</w:t>
+      </w:r>
+      <w:r>
+        <w:rPr>
+          <w:lang w:bidi="fa-IR"/>
+        </w:rPr>
+        <w:t xml:space="preserve"> of this vector. We will examine different values of </w:t>
+      </w:r>
+      <w:r>
+        <w:rPr>
+          <w:b/>
+          <w:bCs/>
+          <w:lang w:bidi="fa-IR"/>
+        </w:rPr>
+        <w:t>p</w:t>
+      </w:r>
+      <w:r>
+        <w:rPr>
+          <w:lang w:bidi="fa-IR"/>
+        </w:rPr>
+        <w:t xml:space="preserve"> and, for each one, plot all the points whose distance from the origin is </w:t>
+      </w:r>
+      <w:r>
+        <w:rPr>
+          <w:b/>
+          <w:bCs/>
+          <w:lang w:bidi="fa-IR"/>
+        </w:rPr>
+        <w:t>3</w:t>
+      </w:r>
+      <w:r>
+        <w:rPr>
+          <w:lang w:bidi="fa-IR"/>
+        </w:rPr>
+        <w:t>.</w:t>
+      </w:r>
+    </w:p>
+    <w:p>
+      <w:pPr>
+        <w:rPr>
+          <w:lang w:bidi="fa-IR"/>
+        </w:rPr>
+      </w:pPr>
+      <w:r>
+        <w:rPr>
+          <w:lang w:bidi="fa-IR"/>
+        </w:rPr>
+        <w:t xml:space="preserve">Let's start with </w:t>
+      </w:r>
+      <w:r>
+        <w:rPr>
+          <w:b/>
+          <w:bCs/>
+          <w:lang w:bidi="fa-IR"/>
+        </w:rPr>
+        <w:t>p = 1</w:t>
+      </w:r>
+      <w:r>
+        <w:rPr>
+          <w:lang w:bidi="fa-IR"/>
+        </w:rPr>
+        <w:t>.</w:t>
+      </w:r>
+    </w:p>
+    <w:p>
+      <w:pPr>
+        <w:rPr>
+          <w:lang w:bidi="fa-IR"/>
+        </w:rPr>
+      </w:pPr>
+      <w:r>
+        <w:rPr>
+          <w:lang w:bidi="fa-IR"/>
+        </w:rPr>
+        <w:t xml:space="preserve">This gives us the </w:t>
+      </w:r>
+      <w:r>
+        <w:rPr>
+          <w:b/>
+          <w:bCs/>
+          <w:lang w:bidi="fa-IR"/>
+        </w:rPr>
+        <w:t>Manhattan</w:t>
+      </w:r>
+      <w:r>
+        <w:rPr>
+          <w:lang w:bidi="fa-IR"/>
+        </w:rPr>
+        <w:t xml:space="preserve">, or </w:t>
+      </w:r>
+      <w:r>
+        <w:rPr>
+          <w:b/>
+          <w:bCs/>
+          <w:lang w:bidi="fa-IR"/>
+        </w:rPr>
+        <w:t>Taxicab, norm</w:t>
+      </w:r>
+      <w:r>
+        <w:rPr>
+          <w:lang w:bidi="fa-IR"/>
+        </w:rPr>
+        <w:t xml:space="preserve">. By moving only up, down, left, and right, we can trace all the points that are exactly three units away from the origin. As you can see, the resulting shape is a </w:t>
+      </w:r>
+      <w:r>
+        <w:rPr>
+          <w:b/>
+          <w:bCs/>
+          <w:lang w:bidi="fa-IR"/>
+        </w:rPr>
+        <w:t>diamond</w:t>
+      </w:r>
+      <w:r>
+        <w:rPr>
+          <w:lang w:bidi="fa-IR"/>
+        </w:rPr>
+        <w:t>.</w:t>
+      </w:r>
+    </w:p>
+    <w:p>
+      <w:pPr>
+        <w:rPr>
+          <w:lang w:bidi="fa-IR"/>
+        </w:rPr>
+      </w:pPr>
+      <w:r>
+        <w:rPr>
+          <w:lang w:bidi="fa-IR"/>
+        </w:rPr>
+        <w:t xml:space="preserve">Now let's set </w:t>
+      </w:r>
+      <w:r>
+        <w:rPr>
+          <w:b/>
+          <w:bCs/>
+          <w:lang w:bidi="fa-IR"/>
+        </w:rPr>
+        <w:t>p = 2</w:t>
+      </w:r>
+      <w:r>
+        <w:rPr>
+          <w:lang w:bidi="fa-IR"/>
+        </w:rPr>
+        <w:t>.</w:t>
+      </w:r>
+    </w:p>
+    <w:p>
+      <w:pPr>
+        <w:rPr>
+          <w:lang w:bidi="fa-IR"/>
+        </w:rPr>
+      </w:pPr>
+      <w:r>
+        <w:rPr>
+          <w:lang w:bidi="fa-IR"/>
+        </w:rPr>
+        <w:t xml:space="preserve">In this case, we are simply working in the usual Euclidean space. All points that are three units away from the origin form a </w:t>
+      </w:r>
+      <w:r>
+        <w:rPr>
+          <w:b/>
+          <w:bCs/>
+          <w:lang w:bidi="fa-IR"/>
+        </w:rPr>
+        <w:t>circle</w:t>
+      </w:r>
+      <w:r>
+        <w:rPr>
+          <w:lang w:bidi="fa-IR"/>
+        </w:rPr>
+        <w:t xml:space="preserve"> with radius </w:t>
+      </w:r>
+      <w:r>
+        <w:rPr>
+          <w:b/>
+          <w:bCs/>
+          <w:lang w:bidi="fa-IR"/>
+        </w:rPr>
+        <w:t>3</w:t>
+      </w:r>
+      <w:r>
+        <w:rPr>
+          <w:lang w:bidi="fa-IR"/>
+        </w:rPr>
+        <w:t>.</w:t>
+      </w:r>
+    </w:p>
+    <w:p>
+      <w:pPr>
+        <w:rPr>
+          <w:lang w:bidi="fa-IR"/>
+        </w:rPr>
+      </w:pPr>
+      <w:r>
+        <w:rPr>
+          <w:lang w:bidi="fa-IR"/>
+        </w:rPr>
+        <w:t xml:space="preserve">Now let's gradually increase the value of </w:t>
+      </w:r>
+      <w:r>
+        <w:rPr>
+          <w:b/>
+          <w:bCs/>
+          <w:lang w:bidi="fa-IR"/>
+        </w:rPr>
+        <w:t>p</w:t>
+      </w:r>
+      <w:r>
+        <w:rPr>
+          <w:lang w:bidi="fa-IR"/>
+        </w:rPr>
+        <w:t xml:space="preserve"> and let it approach </w:t>
+      </w:r>
+      <w:r>
+        <w:rPr>
+          <w:b/>
+          <w:bCs/>
+          <w:lang w:bidi="fa-IR"/>
+        </w:rPr>
+        <w:t>infinity</w:t>
+      </w:r>
+      <w:r>
+        <w:rPr>
+          <w:lang w:bidi="fa-IR"/>
+        </w:rPr>
+        <w:t>.</w:t>
+      </w:r>
+    </w:p>
+    <w:p>
+      <w:pPr>
+        <w:rPr>
+          <w:lang w:bidi="fa-IR"/>
+        </w:rPr>
+      </w:pPr>
+      <w:r>
+        <w:rPr>
+          <w:lang w:bidi="fa-IR"/>
+        </w:rPr>
+        <w:t xml:space="preserve">Something interesting happens. By simplifying the limit, we obtain what is known as the </w:t>
+      </w:r>
+      <w:r>
+        <w:rPr>
+          <w:b/>
+          <w:bCs/>
+          <w:lang w:bidi="fa-IR"/>
+        </w:rPr>
+        <w:t>infinity norm</w:t>
+      </w:r>
+      <w:r>
+        <w:rPr>
+          <w:lang w:bidi="fa-IR"/>
+        </w:rPr>
+        <w:t xml:space="preserve">. Under this norm, the resulting shape is a </w:t>
+      </w:r>
+      <w:r>
+        <w:rPr>
+          <w:b/>
+          <w:bCs/>
+          <w:lang w:bidi="fa-IR"/>
+        </w:rPr>
+        <w:t>square</w:t>
+      </w:r>
+      <w:r>
+        <w:rPr>
+          <w:lang w:bidi="fa-IR"/>
+        </w:rPr>
+        <w:t>.</w:t>
+      </w:r>
+    </w:p>
+    <w:p>
+      <w:pPr>
+        <w:rPr>
+          <w:lang w:bidi="fa-IR"/>
+        </w:rPr>
+      </w:pPr>
+      <w:r>
+        <w:rPr>
+          <w:lang w:bidi="fa-IR"/>
+        </w:rPr>
+        <w:t xml:space="preserve">The same ideas apply when we set the radius to one. In that case, the set of all points whose norm is less than or equal to one is called the </w:t>
+      </w:r>
+      <w:r>
+        <w:rPr>
+          <w:i/>
+          <w:iCs/>
+          <w:lang w:bidi="fa-IR"/>
+        </w:rPr>
+        <w:t>unit ball</w:t>
+      </w:r>
+      <w:r>
+        <w:rPr>
+          <w:lang w:bidi="fa-IR"/>
+        </w:rPr>
+        <w:t>.</w:t>
+      </w:r>
+      <w:r>
+        <w:rPr>
+          <w:lang w:bidi="fa-IR"/>
+        </w:rPr>
+        <w:t xml:space="preserve"> </w:t>
+      </w:r>
+    </w:p>
+    <w:p>
+      <w:pPr>
+        <w:rPr>
+          <w:lang w:bidi="fa-IR"/>
+        </w:rPr>
+      </w:pPr>
+      <w:r>
+        <w:rPr>
+          <w:lang w:bidi="fa-IR"/>
+        </w:rPr>
+        <w:t xml:space="preserve">So , </w:t>
+      </w:r>
+      <w:r>
+        <w:rPr>
+          <w:lang w:bidi="fa-IR"/>
+        </w:rPr>
+        <w:t>Let's quickly recap.</w:t>
+      </w:r>
+    </w:p>
+    <w:p>
+      <w:pPr>
+        <w:rPr>
+          <w:lang w:bidi="fa-IR"/>
+        </w:rPr>
+      </w:pPr>
+      <w:r>
+        <w:rPr>
+          <w:lang w:bidi="fa-IR"/>
+        </w:rPr>
+        <w:lastRenderedPageBreak/>
+        <w:t xml:space="preserve">For </w:t>
+      </w:r>
+      <w:r>
+        <w:rPr>
+          <w:b/>
+          <w:bCs/>
+          <w:lang w:bidi="fa-IR"/>
+        </w:rPr>
+        <w:t>p = 1</w:t>
+      </w:r>
+      <w:r>
+        <w:rPr>
+          <w:lang w:bidi="fa-IR"/>
+        </w:rPr>
+        <w:t xml:space="preserve">, the unit ball is a </w:t>
+      </w:r>
+      <w:r>
+        <w:rPr>
+          <w:b/>
+          <w:bCs/>
+          <w:lang w:bidi="fa-IR"/>
+        </w:rPr>
+        <w:t>diamond</w:t>
+      </w:r>
+      <w:r>
+        <w:rPr>
+          <w:lang w:bidi="fa-IR"/>
+        </w:rPr>
+        <w:t xml:space="preserve">. The corresponding norm is called the </w:t>
+      </w:r>
+      <w:r>
+        <w:rPr>
+          <w:b/>
+          <w:bCs/>
+          <w:lang w:bidi="fa-IR"/>
+        </w:rPr>
+        <w:t>Taxicab norm</w:t>
+      </w:r>
+      <w:r>
+        <w:rPr>
+          <w:lang w:bidi="fa-IR"/>
+        </w:rPr>
+        <w:t xml:space="preserve">, also known as the </w:t>
+      </w:r>
+      <w:r>
+        <w:rPr>
+          <w:b/>
+          <w:bCs/>
+          <w:lang w:bidi="fa-IR"/>
+        </w:rPr>
+        <w:t>Manhattan norm</w:t>
+      </w:r>
+      <w:r>
+        <w:rPr>
+          <w:lang w:bidi="fa-IR"/>
+        </w:rPr>
+        <w:t>.</w:t>
+      </w:r>
+    </w:p>
+    <w:p>
+      <w:pPr>
+        <w:rPr>
+          <w:lang w:bidi="fa-IR"/>
+        </w:rPr>
+      </w:pPr>
+      <w:r>
+        <w:rPr>
+          <w:lang w:bidi="fa-IR"/>
+        </w:rPr>
+        <w:t xml:space="preserve">For </w:t>
+      </w:r>
+      <w:r>
+        <w:rPr>
+          <w:b/>
+          <w:bCs/>
+          <w:lang w:bidi="fa-IR"/>
+        </w:rPr>
+        <w:t>p = 2</w:t>
+      </w:r>
+      <w:r>
+        <w:rPr>
+          <w:lang w:bidi="fa-IR"/>
+        </w:rPr>
+        <w:t xml:space="preserve">, we obtain the familiar </w:t>
+      </w:r>
+      <w:r>
+        <w:rPr>
+          <w:b/>
+          <w:bCs/>
+          <w:lang w:bidi="fa-IR"/>
+        </w:rPr>
+        <w:t>Euclidean norm</w:t>
+      </w:r>
+      <w:r>
+        <w:rPr>
+          <w:lang w:bidi="fa-IR"/>
+        </w:rPr>
+        <w:t xml:space="preserve">, whose unit ball is a </w:t>
+      </w:r>
+      <w:r>
+        <w:rPr>
+          <w:b/>
+          <w:bCs/>
+          <w:lang w:bidi="fa-IR"/>
+        </w:rPr>
+        <w:t>circle</w:t>
+      </w:r>
+      <w:r>
+        <w:rPr>
+          <w:lang w:bidi="fa-IR"/>
+        </w:rPr>
+        <w:t>.</w:t>
+      </w:r>
+    </w:p>
+    <w:p>
+      <w:pPr>
+        <w:rPr>
+          <w:b/>
+          <w:bCs/>
+          <w:rtl/>
+          <w:lang w:bidi="fa-IR"/>
+        </w:rPr>
+      </w:pPr>
+      <w:r>
+        <w:rPr>
+          <w:lang w:bidi="fa-IR"/>
+        </w:rPr>
+        <w:t xml:space="preserve">Finally, as </w:t>
+      </w:r>
+      <w:r>
+        <w:rPr>
+          <w:b/>
+          <w:bCs/>
+          <w:lang w:bidi="fa-IR"/>
+        </w:rPr>
+        <w:t>p</w:t>
+      </w:r>
+      <w:r>
+        <w:rPr>
+          <w:lang w:bidi="fa-IR"/>
+        </w:rPr>
+        <w:t xml:space="preserve"> approaches </w:t>
+      </w:r>
+      <w:r>
+        <w:rPr>
+          <w:b/>
+          <w:bCs/>
+          <w:lang w:bidi="fa-IR"/>
+        </w:rPr>
+        <w:t>infinity</w:t>
+      </w:r>
+      <w:r>
+        <w:rPr>
+          <w:lang w:bidi="fa-IR"/>
+        </w:rPr>
+        <w:t xml:space="preserve">, the unit ball becomes a </w:t>
+      </w:r>
+      <w:r>
+        <w:rPr>
+          <w:b/>
+          <w:bCs/>
+          <w:lang w:bidi="fa-IR"/>
+        </w:rPr>
+        <w:t>square</w:t>
+      </w:r>
+      <w:r>
+        <w:rPr>
+          <w:lang w:bidi="fa-IR"/>
+        </w:rPr>
+        <w:t xml:space="preserve">, and the corresponding norm is called the </w:t>
+      </w:r>
+      <w:r>
+        <w:rPr>
+          <w:b/>
+          <w:bCs/>
+          <w:lang w:bidi="fa-IR"/>
+        </w:rPr>
+        <w:t>Chebyshev norm</w:t>
+      </w:r>
+      <w:r>
         <w:rPr>
           <w:rFonts w:hint="cs"/>
+          <w:b/>
+          <w:bCs/>
           <w:rtl/>
           <w:lang w:bidi="fa-IR"/>
         </w:rPr>
-      </w:pPr>
-      <w:r>
-        <w:rPr>
-          <w:lang w:bidi="fa-IR"/>
-        </w:rPr>
-        <w:t>Norm of x is always non-negative</w:t>
-      </w:r>
-    </w:p>
-    <w:p>
-      <w:pPr>
-        <w:rPr>
-          <w:lang w:bidi="fa-IR"/>
-        </w:rPr>
-      </w:pPr>
-      <w:r>
-        <w:rPr>
-          <w:lang w:bidi="fa-IR"/>
-        </w:rPr>
-        <w:t>Let's go through the proof together.</w:t>
-      </w:r>
-    </w:p>
-    <w:p>
-      <w:pPr>
-        <w:rPr>
-          <w:lang w:bidi="fa-IR"/>
-        </w:rPr>
-      </w:pPr>
-      <w:r>
-        <w:rPr>
-          <w:lang w:bidi="fa-IR"/>
-        </w:rPr>
-        <w:t xml:space="preserve">We begin with the </w:t>
-      </w:r>
-      <w:r>
-        <w:rPr>
-          <w:b/>
-          <w:bCs/>
-          <w:lang w:bidi="fa-IR"/>
-        </w:rPr>
-        <w:t>triangle inequality</w:t>
-      </w:r>
-      <w:r>
-        <w:rPr>
-          <w:lang w:bidi="fa-IR"/>
-        </w:rPr>
         <w:t>.</w:t>
       </w:r>
     </w:p>
     <w:p>
       <w:pPr>
         <w:rPr>
-          <w:lang w:bidi="fa-IR"/>
-        </w:rPr>
-      </w:pPr>
-      <w:r>
-        <w:rPr>
-          <w:lang w:bidi="fa-IR"/>
-        </w:rPr>
-        <w:t>Next, we substitute the appropriate vector and simplify the resulting expression.</w:t>
-      </w:r>
-    </w:p>
-    <w:p>
-      <w:pPr>
-        <w:rPr>
-          <w:lang w:bidi="fa-IR"/>
-        </w:rPr>
-      </w:pPr>
-      <w:r>
-        <w:rPr>
-          <w:lang w:bidi="fa-IR"/>
-        </w:rPr>
-        <w:t>Finally, after a little rearrangement, we obtain exactly what we wanted to prove:</w:t>
-      </w:r>
-    </w:p>
-    <w:p>
-      <w:pPr>
-        <w:rPr>
-          <w:lang w:bidi="fa-IR"/>
-        </w:rPr>
-      </w:pPr>
-      <w:r>
-        <w:rPr>
-          <w:lang w:bidi="fa-IR"/>
-        </w:rPr>
-        <w:t>Intuitively, this result is exactly what we would expect.</w:t>
-      </w:r>
-    </w:p>
-    <w:p>
-      <w:pPr>
-        <w:rPr>
-          <w:lang w:bidi="fa-IR"/>
-        </w:rPr>
-      </w:pPr>
-      <w:r>
-        <w:rPr>
-          <w:lang w:bidi="fa-IR"/>
-        </w:rPr>
-        <w:t>Since a norm represents the length of a vector, and a length can never be negative, So the result agrees perfectly with our geometric intuition.</w:t>
-      </w:r>
-    </w:p>
-    <w:p>
-      <w:pPr>
-        <w:rPr>
-          <w:lang w:bidi="fa-IR"/>
-        </w:rPr>
-      </w:pPr>
+          <w:b/>
+          <w:bCs/>
+          <w:rtl/>
+          <w:lang w:bidi="fa-IR"/>
+        </w:rPr>
+      </w:pPr>
+      <w:r>
+        <w:rPr>
+          <w:b/>
+          <w:bCs/>
+          <w:lang w:bidi="fa-IR"/>
+        </w:rPr>
+        <w:t xml:space="preserve">10 : </w:t>
+      </w:r>
+    </w:p>
+    <w:p>
+      <w:pPr>
+        <w:rPr>
+          <w:b/>
+          <w:bCs/>
+          <w:rtl/>
+          <w:lang w:bidi="fa-IR"/>
+        </w:rPr>
+      </w:pPr>
+      <w:r>
+        <w:rPr>
+          <w:b/>
+          <w:bCs/>
+          <w:lang w:bidi="fa-IR"/>
+        </w:rPr>
+        <w:t>Now that we understand what a norm is, we're ready to define a normed space.</w:t>
+      </w:r>
+      <w:r>
+        <w:rPr>
+          <w:lang w:bidi="fa-IR"/>
+        </w:rPr>
+        <w:br/>
+      </w:r>
+      <w:r>
+        <w:rPr>
+          <w:b/>
+          <w:bCs/>
+          <w:lang w:bidi="fa-IR"/>
+        </w:rPr>
+        <w:t>Every normed space consists of two fundamental components: a vector space, and a norm defined on that vector space</w:t>
+      </w:r>
+      <w:r>
+        <w:rPr>
+          <w:rFonts w:hint="cs"/>
+          <w:b/>
+          <w:bCs/>
+          <w:rtl/>
+          <w:lang w:bidi="fa-IR"/>
+        </w:rPr>
+        <w:t>.</w:t>
+      </w:r>
+    </w:p>
+    <w:p>
+      <w:pPr>
+        <w:rPr>
+          <w:b/>
+          <w:bCs/>
+          <w:lang w:bidi="fa-IR"/>
+        </w:rPr>
+      </w:pPr>
+      <w:r>
+        <w:rPr>
+          <w:b/>
+          <w:bCs/>
+          <w:lang w:bidi="fa-IR"/>
+        </w:rPr>
+        <w:t>11:</w:t>
+      </w:r>
+    </w:p>
+    <w:p>
+      <w:pPr>
+        <w:rPr>
+          <w:lang w:bidi="fa-IR"/>
+        </w:rPr>
+      </w:pPr>
+      <w:r>
+        <w:rPr>
+          <w:lang w:bidi="fa-IR"/>
+        </w:rPr>
+        <w:t>But the story doesn't end here. Join me in the next video, where we'll see how norms naturally lead to metrics.</w:t>
+      </w:r>
     </w:p>
     <w:p>
       <w:pPr>
@@ -1063,9 +1759,64 @@
     <w:p>
       <w:pPr>
         <w:rPr>
-          <w:lang w:bidi="fa-IR"/>
-        </w:rPr>
-      </w:pPr>
+          <w:rtl/>
+          <w:lang w:bidi="fa-IR"/>
+        </w:rPr>
+      </w:pPr>
+      <w:r>
+        <w:rPr>
+          <w:lang w:bidi="fa-IR"/>
+        </w:rPr>
+        <w:t xml:space="preserve">1 : </w:t>
+      </w:r>
+    </w:p>
+    <w:p>
+      <w:pPr>
+        <w:rPr>
+          <w:rtl/>
+          <w:lang w:bidi="fa-IR"/>
+        </w:rPr>
+      </w:pPr>
+      <w:r>
+        <w:rPr>
+          <w:b/>
+          <w:bCs/>
+          <w:lang w:bidi="fa-IR"/>
+        </w:rPr>
+        <w:t>Hellooo, and welcome back!</w:t>
+      </w:r>
+      <w:r>
+        <w:rPr>
+          <w:lang w:bidi="fa-IR"/>
+        </w:rPr>
+        <w:br/>
+      </w:r>
+      <w:r>
+        <w:rPr>
+          <w:b/>
+          <w:bCs/>
+          <w:lang w:bidi="fa-IR"/>
+        </w:rPr>
+        <w:t>Last time, we learned what norms are and how they measure the length of vectors. But that's only part of the story. In this video, we'll take the next step and discover how norms naturally give rise to metrics</w:t>
+      </w:r>
+      <w:r>
+        <w:rPr>
+          <w:rFonts w:hint="cs"/>
+          <w:b/>
+          <w:bCs/>
+          <w:rtl/>
+          <w:lang w:bidi="fa-IR"/>
+        </w:rPr>
+        <w:t xml:space="preserve">. </w:t>
+      </w:r>
+      <w:r>
+        <w:rPr>
+          <w:b/>
+          <w:bCs/>
+          <w:lang w:bidi="fa-IR"/>
+        </w:rPr>
+        <w:t>So, let's dive in</w:t>
+      </w:r>
     </w:p>
     <w:p>
       <w:pPr>
@@ -1183,6 +1934,7 @@
         <w:rPr>
           <w:lang w:bidi="fa-IR"/>
         </w:rPr>
+        <w:lastRenderedPageBreak/>
         <w:t>Orthogonality in inner product spaces</w:t>
       </w:r>
     </w:p>

</xml_diff>